<commit_message>
Clarify message routing and official appeal channels in bot rules
</commit_message>
<xml_diff>
--- a/legal/user-agreement.docx
+++ b/legal/user-agreement.docx
@@ -15,7 +15,7 @@
         <w:jc w:val="both"/>
       </w:pPr>
       <w:r>
-        <w:t>Редакция 3.0 от 29.09.2026. Чат-бот «На связи_регион40».</w:t>
+        <w:t>Редакция 3.1 от 29.09.2026. Чат-бот «На связи_регион40».</w:t>
       </w:r>
     </w:p>
     <w:p>
@@ -31,7 +31,15 @@
         <w:jc w:val="both"/>
       </w:pPr>
       <w:r>
-        <w:t>Чат-бот принимает сообщения о проблемах Калужской области, направляет их ответственным сотрудникам и доставляет ответ в личный диалог MAX. Для официального обращения по Федеральному закону № 59-ФЗ используйте предусмотренные соответствующим органом официальные способы подачи. Обязательные права граждан сохраняются.</w:t>
+        <w:t>Чат-бот принимает сообщения о проблемах Калужской области, направляет их ответственным сотрудникам и доставляет ответ в личный диалог MAX.</w:t>
+      </w:r>
+    </w:p>
+    <w:p>
+      <w:pPr>
+        <w:jc w:val="both"/>
+      </w:pPr>
+      <w:r>
+        <w:t>Сообщения в этом чат-боте рассматриваются в рамках дополнительного канала обратной связи и не регистрируются как официальные обращения в порядке Федерального закона от 02.05.2006 № 59-ФЗ «О порядке рассмотрения обращений граждан Российской Федерации». Для подачи официального обращения используйте электронную приёмную соответствующего органа, Госуслуги при наличии нужного сервиса или письменное обращение. Предусмотренные законом права граждан сохраняются.</w:t>
       </w:r>
     </w:p>
     <w:p>
@@ -104,7 +112,15 @@
         <w:jc w:val="both"/>
       </w:pPr>
       <w:r>
-        <w:t>Распределение, подготовку и проверку ответов выполняют уполномоченные сотрудники. Получателями могут быть органы власти, муниципалитеты и компетентные организации, включая региональные подразделения Социального фонда России и фонда «Защитники Отечества». Бот доставляет ответ и предлагает его оценить. Подписка на каналы MAX добровольна.</w:t>
+        <w:t>Переданные вами описание проблемы и фотографии направляются специалистам органов государственной власти, органов местного самоуправления и иных компетентных организаций для рассмотрения сообщения и подготовки ответа. Не включайте персональные данные.</w:t>
+      </w:r>
+    </w:p>
+    <w:p>
+      <w:pPr>
+        <w:jc w:val="both"/>
+      </w:pPr>
+      <w:r>
+        <w:t>Распределение, подготовку и проверку ответов выполняют уполномоченные сотрудники. К компетентным организациям относятся в том числе региональные подразделения Социального фонда России и фонда «Защитники Отечества». Бот доставляет ответ и предлагает его оценить. Подписка на каналы MAX добровольна.</w:t>
       </w:r>
     </w:p>
     <w:p>

</xml_diff>